<commit_message>
Actualizacion de documentos de servicio social
</commit_message>
<xml_diff>
--- a/ITC-VI-PO-002-02 SOLICITUD DE SERV. SOCIAL.docx
+++ b/ITC-VI-PO-002-02 SOLICITUD DE SERV. SOCIAL.docx
@@ -72,7 +72,7 @@
               </wp:anchor>
             </w:drawing>
           </mc:Choice>
-          <mc:Fallback xmlns:sl="http://schemas.openxmlformats.org/schemaLibrary/2006/main" xmlns:a="http://schemas.openxmlformats.org/drawingml/2006/main" xmlns:pic="http://schemas.openxmlformats.org/drawingml/2006/picture" xmlns:c="http://schemas.openxmlformats.org/drawingml/2006/chart" xmlns:lc="http://schemas.openxmlformats.org/drawingml/2006/lockedCanvas" xmlns:dgm="http://schemas.openxmlformats.org/drawingml/2006/diagram" xmlns:w16="http://schemas.microsoft.com/office/word/2018/wordml" xmlns:w16cex="http://schemas.microsoft.com/office/word/2018/wordml/cex" xmlns:w16cid="http://schemas.microsoft.com/office/word/2016/wordml/cid" xmlns="http://schemas.microsoft.com/office/tasks/2019/documenttasks" xmlns:cr="http://schemas.microsoft.com/office/comments/2020/reactions">
+          <mc:Fallback xmlns:cr="http://schemas.microsoft.com/office/comments/2020/reactions" xmlns="http://schemas.microsoft.com/office/tasks/2019/documenttasks" xmlns:w16cid="http://schemas.microsoft.com/office/word/2016/wordml/cid" xmlns:w16cex="http://schemas.microsoft.com/office/word/2018/wordml/cex" xmlns:w16="http://schemas.microsoft.com/office/word/2018/wordml" xmlns:dgm="http://schemas.openxmlformats.org/drawingml/2006/diagram" xmlns:lc="http://schemas.openxmlformats.org/drawingml/2006/lockedCanvas" xmlns:c="http://schemas.openxmlformats.org/drawingml/2006/chart" xmlns:pic="http://schemas.openxmlformats.org/drawingml/2006/picture" xmlns:a="http://schemas.openxmlformats.org/drawingml/2006/main" xmlns:sl="http://schemas.openxmlformats.org/schemaLibrary/2006/main">
             <w:drawing>
               <wp:anchor allowOverlap="1" behindDoc="0" distB="0" distT="0" distL="114300" distR="114300" hidden="0" layoutInCell="1" locked="0" relativeHeight="0" simplePos="0">
                 <wp:simplePos x="0" y="0"/>
@@ -449,8 +449,6 @@
           <w:rFonts w:ascii="Arial" w:eastAsia="Arial" w:hAnsi="Arial" w:cs="Arial"/>
         </w:rPr>
       </w:pPr>
-      <w:bookmarkStart w:id="0" w:name="_GoBack"/>
-      <w:bookmarkEnd w:id="0"/>
     </w:p>
     <w:p>
       <w:pPr>
@@ -510,7 +508,13 @@
         <w:rPr>
           <w:rFonts w:ascii="Arial" w:eastAsia="Arial" w:hAnsi="Arial" w:cs="Arial"/>
         </w:rPr>
-        <w:t xml:space="preserve">Puesto: (11) </w:t>
+        <w:t>Puesto: (11)</w:t>
+      </w:r>
+      <w:r>
+        <w:rPr>
+          <w:rFonts w:ascii="Arial" w:eastAsia="Arial" w:hAnsi="Arial" w:cs="Arial"/>
+        </w:rPr>
+        <w:t xml:space="preserve"> </w:t>
       </w:r>
     </w:p>
     <w:p>
@@ -1091,1520 +1095,13 @@
     </w:p>
     <w:p>
       <w:pPr>
-        <w:jc w:val="center"/>
-        <w:rPr>
-          <w:rFonts w:ascii="Arial" w:eastAsia="Arial" w:hAnsi="Arial" w:cs="Arial"/>
-        </w:rPr>
-      </w:pPr>
-    </w:p>
-    <w:p>
-      <w:pPr>
-        <w:jc w:val="center"/>
-        <w:rPr>
-          <w:rFonts w:ascii="Arial" w:eastAsia="Arial" w:hAnsi="Arial" w:cs="Arial"/>
-        </w:rPr>
-      </w:pPr>
-    </w:p>
-    <w:p>
-      <w:pPr>
-        <w:jc w:val="center"/>
-        <w:rPr>
-          <w:rFonts w:ascii="Arial" w:eastAsia="Arial" w:hAnsi="Arial" w:cs="Arial"/>
-        </w:rPr>
-      </w:pPr>
-    </w:p>
-    <w:p>
-      <w:pPr>
-        <w:jc w:val="center"/>
-        <w:rPr>
-          <w:rFonts w:ascii="Arial" w:eastAsia="Arial" w:hAnsi="Arial" w:cs="Arial"/>
-        </w:rPr>
-      </w:pPr>
-    </w:p>
-    <w:p>
-      <w:pPr>
-        <w:jc w:val="center"/>
-        <w:rPr>
-          <w:rFonts w:ascii="Arial" w:eastAsia="Arial" w:hAnsi="Arial" w:cs="Arial"/>
-          <w:sz w:val="24"/>
-          <w:szCs w:val="24"/>
-        </w:rPr>
-      </w:pPr>
-      <w:r>
-        <w:rPr>
-          <w:rFonts w:ascii="Arial" w:eastAsia="Arial" w:hAnsi="Arial" w:cs="Arial"/>
-          <w:b/>
-          <w:bCs/>
-          <w:sz w:val="24"/>
-          <w:szCs w:val="24"/>
-        </w:rPr>
-        <w:lastRenderedPageBreak/>
-        <w:t>INSTRUCTIVO DE LLENADO</w:t>
-      </w:r>
-    </w:p>
-    <w:p>
-      <w:pPr>
-        <w:rPr>
-          <w:rFonts w:ascii="Arial" w:eastAsia="Arial" w:hAnsi="Arial" w:cs="Arial"/>
-        </w:rPr>
-      </w:pPr>
-    </w:p>
-    <w:tbl>
-      <w:tblPr>
-        <w:tblStyle w:val="a0"/>
-        <w:tblW w:w="10064" w:type="dxa"/>
-        <w:tblInd w:w="142" w:type="dxa"/>
-        <w:tblBorders>
-          <w:top w:val="single" w:sz="4" w:space="0" w:color="000000"/>
-          <w:left w:val="single" w:sz="4" w:space="0" w:color="000000"/>
-          <w:bottom w:val="single" w:sz="4" w:space="0" w:color="000000"/>
-          <w:right w:val="single" w:sz="4" w:space="0" w:color="000000"/>
-          <w:insideH w:val="single" w:sz="4" w:space="0" w:color="000000"/>
-          <w:insideV w:val="single" w:sz="4" w:space="0" w:color="000000"/>
-        </w:tblBorders>
-        <w:tblLayout w:type="fixed"/>
-        <w:tblLook w:val="0000" w:firstRow="0" w:lastRow="0" w:firstColumn="0" w:lastColumn="0" w:noHBand="0" w:noVBand="0"/>
-      </w:tblPr>
-      <w:tblGrid>
-        <w:gridCol w:w="1559"/>
-        <w:gridCol w:w="8505"/>
-      </w:tblGrid>
-      <w:tr>
-        <w:tc>
-          <w:tcPr>
-            <w:tcW w:w="1559" w:type="dxa"/>
-          </w:tcPr>
-          <w:p>
-            <w:pPr>
-              <w:pBdr>
-                <w:top w:val="nil"/>
-                <w:left w:val="nil"/>
-                <w:bottom w:val="nil"/>
-                <w:right w:val="nil"/>
-                <w:between w:val="nil"/>
-              </w:pBdr>
-              <w:tabs>
-                <w:tab w:val="center" w:pos="4419"/>
-                <w:tab w:val="right" w:pos="8838"/>
-                <w:tab w:val="left" w:pos="851"/>
-              </w:tabs>
-              <w:jc w:val="center"/>
-              <w:rPr>
-                <w:rFonts w:ascii="Arial" w:eastAsia="Arial" w:hAnsi="Arial" w:cs="Arial"/>
-                <w:color w:val="000000"/>
-                <w:sz w:val="24"/>
-                <w:szCs w:val="24"/>
-              </w:rPr>
-            </w:pPr>
-            <w:r>
-              <w:rPr>
-                <w:rFonts w:ascii="Arial" w:eastAsia="Arial" w:hAnsi="Arial" w:cs="Arial"/>
-                <w:b/>
-                <w:bCs/>
-                <w:color w:val="000000"/>
-                <w:sz w:val="24"/>
-                <w:szCs w:val="24"/>
-              </w:rPr>
-              <w:t>NÚMERO</w:t>
-            </w:r>
-          </w:p>
-        </w:tc>
-        <w:tc>
-          <w:tcPr>
-            <w:tcW w:w="8505" w:type="dxa"/>
-          </w:tcPr>
-          <w:p>
-            <w:pPr>
-              <w:pBdr>
-                <w:top w:val="nil"/>
-                <w:left w:val="nil"/>
-                <w:bottom w:val="nil"/>
-                <w:right w:val="nil"/>
-                <w:between w:val="nil"/>
-              </w:pBdr>
-              <w:tabs>
-                <w:tab w:val="center" w:pos="4419"/>
-                <w:tab w:val="right" w:pos="8838"/>
-                <w:tab w:val="left" w:pos="851"/>
-              </w:tabs>
-              <w:jc w:val="center"/>
-              <w:rPr>
-                <w:rFonts w:ascii="Arial" w:eastAsia="Arial" w:hAnsi="Arial" w:cs="Arial"/>
-                <w:color w:val="000000"/>
-                <w:sz w:val="24"/>
-                <w:szCs w:val="24"/>
-              </w:rPr>
-            </w:pPr>
-            <w:r>
-              <w:rPr>
-                <w:rFonts w:ascii="Arial" w:eastAsia="Arial" w:hAnsi="Arial" w:cs="Arial"/>
-                <w:b/>
-                <w:bCs/>
-                <w:color w:val="000000"/>
-                <w:sz w:val="24"/>
-                <w:szCs w:val="24"/>
-              </w:rPr>
-              <w:t>DESCRIPCIÓN</w:t>
-            </w:r>
-          </w:p>
-        </w:tc>
-      </w:tr>
-      <w:tr>
-        <w:tc>
-          <w:tcPr>
-            <w:tcW w:w="1559" w:type="dxa"/>
-          </w:tcPr>
-          <w:p>
-            <w:pPr>
-              <w:pBdr>
-                <w:top w:val="nil"/>
-                <w:left w:val="nil"/>
-                <w:bottom w:val="nil"/>
-                <w:right w:val="nil"/>
-                <w:between w:val="nil"/>
-              </w:pBdr>
-              <w:tabs>
-                <w:tab w:val="center" w:pos="4419"/>
-                <w:tab w:val="right" w:pos="8838"/>
-              </w:tabs>
-              <w:jc w:val="center"/>
-              <w:rPr>
-                <w:rFonts w:ascii="Arial" w:eastAsia="Arial" w:hAnsi="Arial" w:cs="Arial"/>
-                <w:color w:val="000000"/>
-              </w:rPr>
-            </w:pPr>
-            <w:r>
-              <w:rPr>
-                <w:rFonts w:ascii="Arial" w:eastAsia="Arial" w:hAnsi="Arial" w:cs="Arial"/>
-                <w:color w:val="000000"/>
-              </w:rPr>
-              <w:t>1</w:t>
-            </w:r>
-          </w:p>
-        </w:tc>
-        <w:tc>
-          <w:tcPr>
-            <w:tcW w:w="8505" w:type="dxa"/>
-          </w:tcPr>
-          <w:p>
-            <w:pPr>
-              <w:pBdr>
-                <w:top w:val="nil"/>
-                <w:left w:val="nil"/>
-                <w:bottom w:val="nil"/>
-                <w:right w:val="nil"/>
-                <w:between w:val="nil"/>
-              </w:pBdr>
-              <w:tabs>
-                <w:tab w:val="center" w:pos="4419"/>
-                <w:tab w:val="right" w:pos="8838"/>
-                <w:tab w:val="left" w:pos="32"/>
-              </w:tabs>
-              <w:ind w:left="174"/>
-              <w:rPr>
-                <w:rFonts w:ascii="Arial" w:eastAsia="Arial" w:hAnsi="Arial" w:cs="Arial"/>
-                <w:color w:val="000000"/>
-              </w:rPr>
-            </w:pPr>
-            <w:r>
-              <w:rPr>
-                <w:rFonts w:ascii="Arial" w:eastAsia="Arial" w:hAnsi="Arial" w:cs="Arial"/>
-                <w:color w:val="000000"/>
-              </w:rPr>
-              <w:t>Escribir el nombre completo del (a) estudiante interesado en realizar el Servicio Social.</w:t>
-            </w:r>
-          </w:p>
-        </w:tc>
-      </w:tr>
-      <w:tr>
-        <w:tc>
-          <w:tcPr>
-            <w:tcW w:w="1559" w:type="dxa"/>
-          </w:tcPr>
-          <w:p>
-            <w:pPr>
-              <w:pBdr>
-                <w:top w:val="nil"/>
-                <w:left w:val="nil"/>
-                <w:bottom w:val="nil"/>
-                <w:right w:val="nil"/>
-                <w:between w:val="nil"/>
-              </w:pBdr>
-              <w:tabs>
-                <w:tab w:val="center" w:pos="4419"/>
-                <w:tab w:val="right" w:pos="8838"/>
-              </w:tabs>
-              <w:jc w:val="center"/>
-              <w:rPr>
-                <w:rFonts w:ascii="Arial" w:eastAsia="Arial" w:hAnsi="Arial" w:cs="Arial"/>
-                <w:color w:val="000000"/>
-              </w:rPr>
-            </w:pPr>
-            <w:r>
-              <w:rPr>
-                <w:rFonts w:ascii="Arial" w:eastAsia="Arial" w:hAnsi="Arial" w:cs="Arial"/>
-                <w:color w:val="000000"/>
-              </w:rPr>
-              <w:t>2</w:t>
-            </w:r>
-          </w:p>
-        </w:tc>
-        <w:tc>
-          <w:tcPr>
-            <w:tcW w:w="8505" w:type="dxa"/>
-          </w:tcPr>
-          <w:p>
-            <w:pPr>
-              <w:pBdr>
-                <w:top w:val="nil"/>
-                <w:left w:val="nil"/>
-                <w:bottom w:val="nil"/>
-                <w:right w:val="nil"/>
-                <w:between w:val="nil"/>
-              </w:pBdr>
-              <w:tabs>
-                <w:tab w:val="center" w:pos="4419"/>
-                <w:tab w:val="right" w:pos="8838"/>
-                <w:tab w:val="left" w:pos="32"/>
-              </w:tabs>
-              <w:ind w:left="174"/>
-              <w:rPr>
-                <w:rFonts w:ascii="Arial" w:eastAsia="Arial" w:hAnsi="Arial" w:cs="Arial"/>
-                <w:color w:val="000000"/>
-              </w:rPr>
-            </w:pPr>
-            <w:r>
-              <w:rPr>
-                <w:rFonts w:ascii="Arial" w:eastAsia="Arial" w:hAnsi="Arial" w:cs="Arial"/>
-                <w:color w:val="000000"/>
-              </w:rPr>
-              <w:t>Indicar el sexo: H Hombre M Mujer.</w:t>
-            </w:r>
-          </w:p>
-        </w:tc>
-      </w:tr>
-      <w:tr>
-        <w:tc>
-          <w:tcPr>
-            <w:tcW w:w="1559" w:type="dxa"/>
-          </w:tcPr>
-          <w:p>
-            <w:pPr>
-              <w:pBdr>
-                <w:top w:val="nil"/>
-                <w:left w:val="nil"/>
-                <w:bottom w:val="nil"/>
-                <w:right w:val="nil"/>
-                <w:between w:val="nil"/>
-              </w:pBdr>
-              <w:tabs>
-                <w:tab w:val="center" w:pos="4419"/>
-                <w:tab w:val="right" w:pos="8838"/>
-              </w:tabs>
-              <w:jc w:val="center"/>
-              <w:rPr>
-                <w:rFonts w:ascii="Arial" w:eastAsia="Arial" w:hAnsi="Arial" w:cs="Arial"/>
-                <w:color w:val="000000"/>
-              </w:rPr>
-            </w:pPr>
-            <w:r>
-              <w:rPr>
-                <w:rFonts w:ascii="Arial" w:eastAsia="Arial" w:hAnsi="Arial" w:cs="Arial"/>
-                <w:color w:val="000000"/>
-              </w:rPr>
-              <w:t>3</w:t>
-            </w:r>
-          </w:p>
-        </w:tc>
-        <w:tc>
-          <w:tcPr>
-            <w:tcW w:w="8505" w:type="dxa"/>
-          </w:tcPr>
-          <w:p>
-            <w:pPr>
-              <w:pBdr>
-                <w:top w:val="nil"/>
-                <w:left w:val="nil"/>
-                <w:bottom w:val="nil"/>
-                <w:right w:val="nil"/>
-                <w:between w:val="nil"/>
-              </w:pBdr>
-              <w:tabs>
-                <w:tab w:val="center" w:pos="4419"/>
-                <w:tab w:val="right" w:pos="8838"/>
-                <w:tab w:val="left" w:pos="32"/>
-              </w:tabs>
-              <w:ind w:left="174"/>
-              <w:rPr>
-                <w:rFonts w:ascii="Arial" w:eastAsia="Arial" w:hAnsi="Arial" w:cs="Arial"/>
-                <w:color w:val="000000"/>
-              </w:rPr>
-            </w:pPr>
-            <w:r>
-              <w:rPr>
-                <w:rFonts w:ascii="Arial" w:eastAsia="Arial" w:hAnsi="Arial" w:cs="Arial"/>
-                <w:color w:val="000000"/>
-              </w:rPr>
-              <w:t>Anotar el número de teléfono particular.</w:t>
-            </w:r>
-          </w:p>
-        </w:tc>
-      </w:tr>
-      <w:tr>
-        <w:tc>
-          <w:tcPr>
-            <w:tcW w:w="1559" w:type="dxa"/>
-          </w:tcPr>
-          <w:p>
-            <w:pPr>
-              <w:pBdr>
-                <w:top w:val="nil"/>
-                <w:left w:val="nil"/>
-                <w:bottom w:val="nil"/>
-                <w:right w:val="nil"/>
-                <w:between w:val="nil"/>
-              </w:pBdr>
-              <w:tabs>
-                <w:tab w:val="center" w:pos="4419"/>
-                <w:tab w:val="right" w:pos="8838"/>
-              </w:tabs>
-              <w:jc w:val="center"/>
-              <w:rPr>
-                <w:rFonts w:ascii="Arial" w:eastAsia="Arial" w:hAnsi="Arial" w:cs="Arial"/>
-                <w:color w:val="000000"/>
-              </w:rPr>
-            </w:pPr>
-            <w:r>
-              <w:rPr>
-                <w:rFonts w:ascii="Arial" w:eastAsia="Arial" w:hAnsi="Arial" w:cs="Arial"/>
-                <w:color w:val="000000"/>
-              </w:rPr>
-              <w:t>4</w:t>
-            </w:r>
-          </w:p>
-        </w:tc>
-        <w:tc>
-          <w:tcPr>
-            <w:tcW w:w="8505" w:type="dxa"/>
-          </w:tcPr>
-          <w:p>
-            <w:pPr>
-              <w:pBdr>
-                <w:top w:val="nil"/>
-                <w:left w:val="nil"/>
-                <w:bottom w:val="nil"/>
-                <w:right w:val="nil"/>
-                <w:between w:val="nil"/>
-              </w:pBdr>
-              <w:tabs>
-                <w:tab w:val="center" w:pos="4419"/>
-                <w:tab w:val="right" w:pos="8838"/>
-                <w:tab w:val="left" w:pos="32"/>
-              </w:tabs>
-              <w:ind w:left="174"/>
-              <w:rPr>
-                <w:rFonts w:ascii="Arial" w:eastAsia="Arial" w:hAnsi="Arial" w:cs="Arial"/>
-                <w:color w:val="000000"/>
-              </w:rPr>
-            </w:pPr>
-            <w:r>
-              <w:rPr>
-                <w:rFonts w:ascii="Arial" w:eastAsia="Arial" w:hAnsi="Arial" w:cs="Arial"/>
-                <w:color w:val="000000"/>
-              </w:rPr>
-              <w:t>Anotar el domicilio particular.</w:t>
-            </w:r>
-          </w:p>
-        </w:tc>
-      </w:tr>
-      <w:tr>
-        <w:tc>
-          <w:tcPr>
-            <w:tcW w:w="1559" w:type="dxa"/>
-          </w:tcPr>
-          <w:p>
-            <w:pPr>
-              <w:pBdr>
-                <w:top w:val="nil"/>
-                <w:left w:val="nil"/>
-                <w:bottom w:val="nil"/>
-                <w:right w:val="nil"/>
-                <w:between w:val="nil"/>
-              </w:pBdr>
-              <w:tabs>
-                <w:tab w:val="center" w:pos="4419"/>
-                <w:tab w:val="right" w:pos="8838"/>
-              </w:tabs>
-              <w:jc w:val="center"/>
-              <w:rPr>
-                <w:rFonts w:ascii="Arial" w:eastAsia="Arial" w:hAnsi="Arial" w:cs="Arial"/>
-                <w:color w:val="000000"/>
-              </w:rPr>
-            </w:pPr>
-            <w:r>
-              <w:rPr>
-                <w:rFonts w:ascii="Arial" w:eastAsia="Arial" w:hAnsi="Arial" w:cs="Arial"/>
-                <w:color w:val="000000"/>
-              </w:rPr>
-              <w:t>5</w:t>
-            </w:r>
-          </w:p>
-        </w:tc>
-        <w:tc>
-          <w:tcPr>
-            <w:tcW w:w="8505" w:type="dxa"/>
-          </w:tcPr>
-          <w:p>
-            <w:pPr>
-              <w:pBdr>
-                <w:top w:val="nil"/>
-                <w:left w:val="nil"/>
-                <w:bottom w:val="nil"/>
-                <w:right w:val="nil"/>
-                <w:between w:val="nil"/>
-              </w:pBdr>
-              <w:tabs>
-                <w:tab w:val="center" w:pos="4419"/>
-                <w:tab w:val="right" w:pos="8838"/>
-                <w:tab w:val="left" w:pos="32"/>
-              </w:tabs>
-              <w:ind w:left="174"/>
-              <w:rPr>
-                <w:rFonts w:ascii="Arial" w:eastAsia="Arial" w:hAnsi="Arial" w:cs="Arial"/>
-                <w:color w:val="000000"/>
-              </w:rPr>
-            </w:pPr>
-            <w:r>
-              <w:rPr>
-                <w:rFonts w:ascii="Arial" w:eastAsia="Arial" w:hAnsi="Arial" w:cs="Arial"/>
-                <w:color w:val="000000"/>
-              </w:rPr>
-              <w:t>Anotar el número de control.</w:t>
-            </w:r>
-          </w:p>
-        </w:tc>
-      </w:tr>
-      <w:tr>
-        <w:tc>
-          <w:tcPr>
-            <w:tcW w:w="1559" w:type="dxa"/>
-          </w:tcPr>
-          <w:p>
-            <w:pPr>
-              <w:pBdr>
-                <w:top w:val="nil"/>
-                <w:left w:val="nil"/>
-                <w:bottom w:val="nil"/>
-                <w:right w:val="nil"/>
-                <w:between w:val="nil"/>
-              </w:pBdr>
-              <w:tabs>
-                <w:tab w:val="center" w:pos="4419"/>
-                <w:tab w:val="right" w:pos="8838"/>
-              </w:tabs>
-              <w:jc w:val="center"/>
-              <w:rPr>
-                <w:rFonts w:ascii="Arial" w:eastAsia="Arial" w:hAnsi="Arial" w:cs="Arial"/>
-                <w:color w:val="000000"/>
-              </w:rPr>
-            </w:pPr>
-            <w:r>
-              <w:rPr>
-                <w:rFonts w:ascii="Arial" w:eastAsia="Arial" w:hAnsi="Arial" w:cs="Arial"/>
-                <w:color w:val="000000"/>
-              </w:rPr>
-              <w:t>6</w:t>
-            </w:r>
-          </w:p>
-        </w:tc>
-        <w:tc>
-          <w:tcPr>
-            <w:tcW w:w="8505" w:type="dxa"/>
-          </w:tcPr>
-          <w:p>
-            <w:pPr>
-              <w:pBdr>
-                <w:top w:val="nil"/>
-                <w:left w:val="nil"/>
-                <w:bottom w:val="nil"/>
-                <w:right w:val="nil"/>
-                <w:between w:val="nil"/>
-              </w:pBdr>
-              <w:tabs>
-                <w:tab w:val="center" w:pos="4419"/>
-                <w:tab w:val="right" w:pos="8838"/>
-                <w:tab w:val="left" w:pos="32"/>
-              </w:tabs>
-              <w:ind w:left="174"/>
-              <w:rPr>
-                <w:rFonts w:ascii="Arial" w:eastAsia="Arial" w:hAnsi="Arial" w:cs="Arial"/>
-                <w:color w:val="000000"/>
-              </w:rPr>
-            </w:pPr>
-            <w:r>
-              <w:rPr>
-                <w:rFonts w:ascii="Arial" w:eastAsia="Arial" w:hAnsi="Arial" w:cs="Arial"/>
-                <w:color w:val="000000"/>
-              </w:rPr>
-              <w:t>Anotar la carrera en la cual se encuentra inscrito.</w:t>
-            </w:r>
-          </w:p>
-        </w:tc>
-      </w:tr>
-      <w:tr>
-        <w:tc>
-          <w:tcPr>
-            <w:tcW w:w="1559" w:type="dxa"/>
-          </w:tcPr>
-          <w:p>
-            <w:pPr>
-              <w:pBdr>
-                <w:top w:val="nil"/>
-                <w:left w:val="nil"/>
-                <w:bottom w:val="nil"/>
-                <w:right w:val="nil"/>
-                <w:between w:val="nil"/>
-              </w:pBdr>
-              <w:tabs>
-                <w:tab w:val="center" w:pos="4419"/>
-                <w:tab w:val="right" w:pos="8838"/>
-              </w:tabs>
-              <w:jc w:val="center"/>
-              <w:rPr>
-                <w:rFonts w:ascii="Arial" w:eastAsia="Arial" w:hAnsi="Arial" w:cs="Arial"/>
-                <w:color w:val="000000"/>
-              </w:rPr>
-            </w:pPr>
-            <w:r>
-              <w:rPr>
-                <w:rFonts w:ascii="Arial" w:eastAsia="Arial" w:hAnsi="Arial" w:cs="Arial"/>
-                <w:color w:val="000000"/>
-              </w:rPr>
-              <w:t>7</w:t>
-            </w:r>
-          </w:p>
-        </w:tc>
-        <w:tc>
-          <w:tcPr>
-            <w:tcW w:w="8505" w:type="dxa"/>
-          </w:tcPr>
-          <w:p>
-            <w:pPr>
-              <w:pBdr>
-                <w:top w:val="nil"/>
-                <w:left w:val="nil"/>
-                <w:bottom w:val="nil"/>
-                <w:right w:val="nil"/>
-                <w:between w:val="nil"/>
-              </w:pBdr>
-              <w:tabs>
-                <w:tab w:val="center" w:pos="4419"/>
-                <w:tab w:val="right" w:pos="8838"/>
-                <w:tab w:val="left" w:pos="32"/>
-              </w:tabs>
-              <w:ind w:left="174"/>
-              <w:rPr>
-                <w:rFonts w:ascii="Arial" w:eastAsia="Arial" w:hAnsi="Arial" w:cs="Arial"/>
-                <w:color w:val="000000"/>
-              </w:rPr>
-            </w:pPr>
-            <w:r>
-              <w:rPr>
-                <w:rFonts w:ascii="Arial" w:eastAsia="Arial" w:hAnsi="Arial" w:cs="Arial"/>
-                <w:color w:val="000000"/>
-              </w:rPr>
-              <w:t>Anotar el periodo en el cual está inscrito.</w:t>
-            </w:r>
-          </w:p>
-        </w:tc>
-      </w:tr>
-      <w:tr>
-        <w:tc>
-          <w:tcPr>
-            <w:tcW w:w="1559" w:type="dxa"/>
-          </w:tcPr>
-          <w:p>
-            <w:pPr>
-              <w:pBdr>
-                <w:top w:val="nil"/>
-                <w:left w:val="nil"/>
-                <w:bottom w:val="nil"/>
-                <w:right w:val="nil"/>
-                <w:between w:val="nil"/>
-              </w:pBdr>
-              <w:tabs>
-                <w:tab w:val="center" w:pos="4419"/>
-                <w:tab w:val="right" w:pos="8838"/>
-              </w:tabs>
-              <w:jc w:val="center"/>
-              <w:rPr>
-                <w:rFonts w:ascii="Arial" w:eastAsia="Arial" w:hAnsi="Arial" w:cs="Arial"/>
-                <w:color w:val="000000"/>
-              </w:rPr>
-            </w:pPr>
-            <w:r>
-              <w:rPr>
-                <w:rFonts w:ascii="Arial" w:eastAsia="Arial" w:hAnsi="Arial" w:cs="Arial"/>
-                <w:color w:val="000000"/>
-              </w:rPr>
-              <w:t>8</w:t>
-            </w:r>
-          </w:p>
-        </w:tc>
-        <w:tc>
-          <w:tcPr>
-            <w:tcW w:w="8505" w:type="dxa"/>
-          </w:tcPr>
-          <w:p>
-            <w:pPr>
-              <w:pBdr>
-                <w:top w:val="nil"/>
-                <w:left w:val="nil"/>
-                <w:bottom w:val="nil"/>
-                <w:right w:val="nil"/>
-                <w:between w:val="nil"/>
-              </w:pBdr>
-              <w:tabs>
-                <w:tab w:val="center" w:pos="4419"/>
-                <w:tab w:val="right" w:pos="8838"/>
-                <w:tab w:val="left" w:pos="32"/>
-              </w:tabs>
-              <w:ind w:left="174"/>
-              <w:rPr>
-                <w:rFonts w:ascii="Arial" w:eastAsia="Arial" w:hAnsi="Arial" w:cs="Arial"/>
-                <w:color w:val="000000"/>
-              </w:rPr>
-            </w:pPr>
-            <w:r>
-              <w:rPr>
-                <w:rFonts w:ascii="Arial" w:eastAsia="Arial" w:hAnsi="Arial" w:cs="Arial"/>
-                <w:color w:val="000000"/>
-              </w:rPr>
-              <w:t>Anotar el semestre que se encuentra cursando actualmente.</w:t>
-            </w:r>
-          </w:p>
-        </w:tc>
-      </w:tr>
-      <w:tr>
-        <w:tc>
-          <w:tcPr>
-            <w:tcW w:w="1559" w:type="dxa"/>
-          </w:tcPr>
-          <w:p>
-            <w:pPr>
-              <w:pBdr>
-                <w:top w:val="nil"/>
-                <w:left w:val="nil"/>
-                <w:bottom w:val="nil"/>
-                <w:right w:val="nil"/>
-                <w:between w:val="nil"/>
-              </w:pBdr>
-              <w:tabs>
-                <w:tab w:val="center" w:pos="4419"/>
-                <w:tab w:val="right" w:pos="8838"/>
-              </w:tabs>
-              <w:jc w:val="center"/>
-              <w:rPr>
-                <w:rFonts w:ascii="Arial" w:eastAsia="Arial" w:hAnsi="Arial" w:cs="Arial"/>
-                <w:color w:val="000000"/>
-              </w:rPr>
-            </w:pPr>
-            <w:r>
-              <w:rPr>
-                <w:rFonts w:ascii="Arial" w:eastAsia="Arial" w:hAnsi="Arial" w:cs="Arial"/>
-                <w:color w:val="000000"/>
-              </w:rPr>
-              <w:t>9</w:t>
-            </w:r>
-          </w:p>
-        </w:tc>
-        <w:tc>
-          <w:tcPr>
-            <w:tcW w:w="8505" w:type="dxa"/>
-          </w:tcPr>
-          <w:p>
-            <w:pPr>
-              <w:pBdr>
-                <w:top w:val="nil"/>
-                <w:left w:val="nil"/>
-                <w:bottom w:val="nil"/>
-                <w:right w:val="nil"/>
-                <w:between w:val="nil"/>
-              </w:pBdr>
-              <w:tabs>
-                <w:tab w:val="center" w:pos="4419"/>
-                <w:tab w:val="right" w:pos="8838"/>
-                <w:tab w:val="left" w:pos="32"/>
-              </w:tabs>
-              <w:ind w:left="174"/>
-              <w:rPr>
-                <w:rFonts w:ascii="Arial" w:eastAsia="Arial" w:hAnsi="Arial" w:cs="Arial"/>
-                <w:color w:val="000000"/>
-              </w:rPr>
-            </w:pPr>
-            <w:r>
-              <w:rPr>
-                <w:rFonts w:ascii="Arial" w:eastAsia="Arial" w:hAnsi="Arial" w:cs="Arial"/>
-                <w:color w:val="000000"/>
-              </w:rPr>
-              <w:t>Anotar el nombre de la dependencia en la que se pretende realizar el Servicio Social.</w:t>
-            </w:r>
-          </w:p>
-        </w:tc>
-      </w:tr>
-      <w:tr>
-        <w:tc>
-          <w:tcPr>
-            <w:tcW w:w="1559" w:type="dxa"/>
-          </w:tcPr>
-          <w:p>
-            <w:pPr>
-              <w:pBdr>
-                <w:top w:val="nil"/>
-                <w:left w:val="nil"/>
-                <w:bottom w:val="nil"/>
-                <w:right w:val="nil"/>
-                <w:between w:val="nil"/>
-              </w:pBdr>
-              <w:tabs>
-                <w:tab w:val="center" w:pos="4419"/>
-                <w:tab w:val="right" w:pos="8838"/>
-              </w:tabs>
-              <w:jc w:val="center"/>
-              <w:rPr>
-                <w:rFonts w:ascii="Arial" w:eastAsia="Arial" w:hAnsi="Arial" w:cs="Arial"/>
-                <w:color w:val="000000"/>
-              </w:rPr>
-            </w:pPr>
-            <w:r>
-              <w:rPr>
-                <w:rFonts w:ascii="Arial" w:eastAsia="Arial" w:hAnsi="Arial" w:cs="Arial"/>
-                <w:color w:val="000000"/>
-              </w:rPr>
-              <w:t>10</w:t>
-            </w:r>
-          </w:p>
-        </w:tc>
-        <w:tc>
-          <w:tcPr>
-            <w:tcW w:w="8505" w:type="dxa"/>
-          </w:tcPr>
-          <w:p>
-            <w:pPr>
-              <w:pBdr>
-                <w:top w:val="nil"/>
-                <w:left w:val="nil"/>
-                <w:bottom w:val="nil"/>
-                <w:right w:val="nil"/>
-                <w:between w:val="nil"/>
-              </w:pBdr>
-              <w:tabs>
-                <w:tab w:val="center" w:pos="4419"/>
-                <w:tab w:val="right" w:pos="8838"/>
-                <w:tab w:val="left" w:pos="32"/>
-              </w:tabs>
-              <w:ind w:left="174"/>
-              <w:rPr>
-                <w:rFonts w:ascii="Arial" w:eastAsia="Arial" w:hAnsi="Arial" w:cs="Arial"/>
-                <w:color w:val="000000"/>
-              </w:rPr>
-            </w:pPr>
-            <w:r>
-              <w:rPr>
-                <w:rFonts w:ascii="Arial" w:eastAsia="Arial" w:hAnsi="Arial" w:cs="Arial"/>
-                <w:color w:val="000000"/>
-              </w:rPr>
-              <w:t>Anotar el nombre completo del titular de la dependencia.</w:t>
-            </w:r>
-          </w:p>
-        </w:tc>
-      </w:tr>
-      <w:tr>
-        <w:tc>
-          <w:tcPr>
-            <w:tcW w:w="1559" w:type="dxa"/>
-          </w:tcPr>
-          <w:p>
-            <w:pPr>
-              <w:pBdr>
-                <w:top w:val="nil"/>
-                <w:left w:val="nil"/>
-                <w:bottom w:val="nil"/>
-                <w:right w:val="nil"/>
-                <w:between w:val="nil"/>
-              </w:pBdr>
-              <w:tabs>
-                <w:tab w:val="center" w:pos="4419"/>
-                <w:tab w:val="right" w:pos="8838"/>
-              </w:tabs>
-              <w:jc w:val="center"/>
-              <w:rPr>
-                <w:rFonts w:ascii="Arial" w:eastAsia="Arial" w:hAnsi="Arial" w:cs="Arial"/>
-                <w:color w:val="000000"/>
-              </w:rPr>
-            </w:pPr>
-            <w:r>
-              <w:rPr>
-                <w:rFonts w:ascii="Arial" w:eastAsia="Arial" w:hAnsi="Arial" w:cs="Arial"/>
-                <w:color w:val="000000"/>
-              </w:rPr>
-              <w:t>11</w:t>
-            </w:r>
-          </w:p>
-        </w:tc>
-        <w:tc>
-          <w:tcPr>
-            <w:tcW w:w="8505" w:type="dxa"/>
-          </w:tcPr>
-          <w:p>
-            <w:pPr>
-              <w:pBdr>
-                <w:top w:val="nil"/>
-                <w:left w:val="nil"/>
-                <w:bottom w:val="nil"/>
-                <w:right w:val="nil"/>
-                <w:between w:val="nil"/>
-              </w:pBdr>
-              <w:tabs>
-                <w:tab w:val="center" w:pos="4419"/>
-                <w:tab w:val="right" w:pos="8838"/>
-              </w:tabs>
-              <w:ind w:left="174"/>
-              <w:rPr>
-                <w:rFonts w:ascii="Arial" w:eastAsia="Arial" w:hAnsi="Arial" w:cs="Arial"/>
-                <w:color w:val="000000"/>
-              </w:rPr>
-            </w:pPr>
-            <w:r>
-              <w:rPr>
-                <w:rFonts w:ascii="Arial" w:eastAsia="Arial" w:hAnsi="Arial" w:cs="Arial"/>
-                <w:color w:val="000000"/>
-              </w:rPr>
-              <w:t>Anotar el nombre del puesto.</w:t>
-            </w:r>
-          </w:p>
-        </w:tc>
-      </w:tr>
-      <w:tr>
-        <w:tc>
-          <w:tcPr>
-            <w:tcW w:w="1559" w:type="dxa"/>
-          </w:tcPr>
-          <w:p>
-            <w:pPr>
-              <w:pBdr>
-                <w:top w:val="nil"/>
-                <w:left w:val="nil"/>
-                <w:bottom w:val="nil"/>
-                <w:right w:val="nil"/>
-                <w:between w:val="nil"/>
-              </w:pBdr>
-              <w:tabs>
-                <w:tab w:val="center" w:pos="4419"/>
-                <w:tab w:val="right" w:pos="8838"/>
-              </w:tabs>
-              <w:jc w:val="center"/>
-              <w:rPr>
-                <w:rFonts w:ascii="Arial" w:eastAsia="Arial" w:hAnsi="Arial" w:cs="Arial"/>
-                <w:color w:val="000000"/>
-              </w:rPr>
-            </w:pPr>
-            <w:r>
-              <w:rPr>
-                <w:rFonts w:ascii="Arial" w:eastAsia="Arial" w:hAnsi="Arial" w:cs="Arial"/>
-                <w:color w:val="000000"/>
-              </w:rPr>
-              <w:t>12</w:t>
-            </w:r>
-          </w:p>
-        </w:tc>
-        <w:tc>
-          <w:tcPr>
-            <w:tcW w:w="8505" w:type="dxa"/>
-          </w:tcPr>
-          <w:p>
-            <w:pPr>
-              <w:pBdr>
-                <w:top w:val="nil"/>
-                <w:left w:val="nil"/>
-                <w:bottom w:val="nil"/>
-                <w:right w:val="nil"/>
-                <w:between w:val="nil"/>
-              </w:pBdr>
-              <w:tabs>
-                <w:tab w:val="center" w:pos="4419"/>
-                <w:tab w:val="right" w:pos="8838"/>
-                <w:tab w:val="left" w:pos="32"/>
-              </w:tabs>
-              <w:ind w:left="174"/>
-              <w:rPr>
-                <w:rFonts w:ascii="Arial" w:eastAsia="Arial" w:hAnsi="Arial" w:cs="Arial"/>
-                <w:color w:val="000000"/>
-              </w:rPr>
-            </w:pPr>
-            <w:r>
-              <w:rPr>
-                <w:rFonts w:ascii="Arial" w:eastAsia="Arial" w:hAnsi="Arial" w:cs="Arial"/>
-                <w:color w:val="000000"/>
-              </w:rPr>
-              <w:t>Anotar el nombre del programa.</w:t>
-            </w:r>
-          </w:p>
-        </w:tc>
-      </w:tr>
-      <w:tr>
-        <w:tc>
-          <w:tcPr>
-            <w:tcW w:w="1559" w:type="dxa"/>
-          </w:tcPr>
-          <w:p>
-            <w:pPr>
-              <w:pBdr>
-                <w:top w:val="nil"/>
-                <w:left w:val="nil"/>
-                <w:bottom w:val="nil"/>
-                <w:right w:val="nil"/>
-                <w:between w:val="nil"/>
-              </w:pBdr>
-              <w:tabs>
-                <w:tab w:val="center" w:pos="4419"/>
-                <w:tab w:val="right" w:pos="8838"/>
-              </w:tabs>
-              <w:jc w:val="center"/>
-              <w:rPr>
-                <w:rFonts w:ascii="Arial" w:eastAsia="Arial" w:hAnsi="Arial" w:cs="Arial"/>
-                <w:color w:val="000000"/>
-              </w:rPr>
-            </w:pPr>
-            <w:r>
-              <w:rPr>
-                <w:rFonts w:ascii="Arial" w:eastAsia="Arial" w:hAnsi="Arial" w:cs="Arial"/>
-                <w:color w:val="000000"/>
-              </w:rPr>
-              <w:t>13</w:t>
-            </w:r>
-          </w:p>
-        </w:tc>
-        <w:tc>
-          <w:tcPr>
-            <w:tcW w:w="8505" w:type="dxa"/>
-          </w:tcPr>
-          <w:p>
-            <w:pPr>
-              <w:pBdr>
-                <w:top w:val="nil"/>
-                <w:left w:val="nil"/>
-                <w:bottom w:val="nil"/>
-                <w:right w:val="nil"/>
-                <w:between w:val="nil"/>
-              </w:pBdr>
-              <w:tabs>
-                <w:tab w:val="center" w:pos="4419"/>
-                <w:tab w:val="right" w:pos="8838"/>
-                <w:tab w:val="left" w:pos="32"/>
-              </w:tabs>
-              <w:ind w:left="174"/>
-              <w:rPr>
-                <w:rFonts w:ascii="Arial" w:eastAsia="Arial" w:hAnsi="Arial" w:cs="Arial"/>
-                <w:color w:val="000000"/>
-              </w:rPr>
-            </w:pPr>
-            <w:r>
-              <w:rPr>
-                <w:rFonts w:ascii="Arial" w:eastAsia="Arial" w:hAnsi="Arial" w:cs="Arial"/>
-                <w:color w:val="000000"/>
-              </w:rPr>
-              <w:t xml:space="preserve">Anotar la modalidad en la que se realizará el Servicio Social (interno </w:t>
-            </w:r>
-            <w:proofErr w:type="spellStart"/>
-            <w:r>
-              <w:rPr>
-                <w:rFonts w:ascii="Arial" w:eastAsia="Arial" w:hAnsi="Arial" w:cs="Arial"/>
-                <w:color w:val="000000"/>
-              </w:rPr>
-              <w:t>ó</w:t>
-            </w:r>
-            <w:proofErr w:type="spellEnd"/>
-            <w:r>
-              <w:rPr>
-                <w:rFonts w:ascii="Arial" w:eastAsia="Arial" w:hAnsi="Arial" w:cs="Arial"/>
-                <w:color w:val="000000"/>
-              </w:rPr>
-              <w:t xml:space="preserve"> externo).</w:t>
-            </w:r>
-          </w:p>
-        </w:tc>
-      </w:tr>
-      <w:tr>
-        <w:tc>
-          <w:tcPr>
-            <w:tcW w:w="1559" w:type="dxa"/>
-          </w:tcPr>
-          <w:p>
-            <w:pPr>
-              <w:pBdr>
-                <w:top w:val="nil"/>
-                <w:left w:val="nil"/>
-                <w:bottom w:val="nil"/>
-                <w:right w:val="nil"/>
-                <w:between w:val="nil"/>
-              </w:pBdr>
-              <w:tabs>
-                <w:tab w:val="center" w:pos="4419"/>
-                <w:tab w:val="right" w:pos="8838"/>
-              </w:tabs>
-              <w:jc w:val="center"/>
-              <w:rPr>
-                <w:rFonts w:ascii="Arial" w:eastAsia="Arial" w:hAnsi="Arial" w:cs="Arial"/>
-                <w:color w:val="000000"/>
-              </w:rPr>
-            </w:pPr>
-            <w:r>
-              <w:rPr>
-                <w:rFonts w:ascii="Arial" w:eastAsia="Arial" w:hAnsi="Arial" w:cs="Arial"/>
-                <w:color w:val="000000"/>
-              </w:rPr>
-              <w:t>14</w:t>
-            </w:r>
-          </w:p>
-        </w:tc>
-        <w:tc>
-          <w:tcPr>
-            <w:tcW w:w="8505" w:type="dxa"/>
-          </w:tcPr>
-          <w:p>
-            <w:pPr>
-              <w:pBdr>
-                <w:top w:val="nil"/>
-                <w:left w:val="nil"/>
-                <w:bottom w:val="nil"/>
-                <w:right w:val="nil"/>
-                <w:between w:val="nil"/>
-              </w:pBdr>
-              <w:tabs>
-                <w:tab w:val="center" w:pos="4419"/>
-                <w:tab w:val="right" w:pos="8838"/>
-                <w:tab w:val="left" w:pos="32"/>
-              </w:tabs>
-              <w:ind w:left="174"/>
-              <w:rPr>
-                <w:rFonts w:ascii="Arial" w:eastAsia="Arial" w:hAnsi="Arial" w:cs="Arial"/>
-                <w:color w:val="000000"/>
-              </w:rPr>
-            </w:pPr>
-            <w:r>
-              <w:rPr>
-                <w:rFonts w:ascii="Arial" w:eastAsia="Arial" w:hAnsi="Arial" w:cs="Arial"/>
-                <w:color w:val="000000"/>
-              </w:rPr>
-              <w:t>Anotar la fecha de inicio.</w:t>
-            </w:r>
-          </w:p>
-        </w:tc>
-      </w:tr>
-      <w:tr>
-        <w:tc>
-          <w:tcPr>
-            <w:tcW w:w="1559" w:type="dxa"/>
-          </w:tcPr>
-          <w:p>
-            <w:pPr>
-              <w:pBdr>
-                <w:top w:val="nil"/>
-                <w:left w:val="nil"/>
-                <w:bottom w:val="nil"/>
-                <w:right w:val="nil"/>
-                <w:between w:val="nil"/>
-              </w:pBdr>
-              <w:tabs>
-                <w:tab w:val="center" w:pos="4419"/>
-                <w:tab w:val="right" w:pos="8838"/>
-              </w:tabs>
-              <w:jc w:val="center"/>
-              <w:rPr>
-                <w:rFonts w:ascii="Arial" w:eastAsia="Arial" w:hAnsi="Arial" w:cs="Arial"/>
-                <w:color w:val="000000"/>
-              </w:rPr>
-            </w:pPr>
-            <w:r>
-              <w:rPr>
-                <w:rFonts w:ascii="Arial" w:eastAsia="Arial" w:hAnsi="Arial" w:cs="Arial"/>
-                <w:color w:val="000000"/>
-              </w:rPr>
-              <w:t>15</w:t>
-            </w:r>
-          </w:p>
-        </w:tc>
-        <w:tc>
-          <w:tcPr>
-            <w:tcW w:w="8505" w:type="dxa"/>
-          </w:tcPr>
-          <w:p>
-            <w:pPr>
-              <w:pBdr>
-                <w:top w:val="nil"/>
-                <w:left w:val="nil"/>
-                <w:bottom w:val="nil"/>
-                <w:right w:val="nil"/>
-                <w:between w:val="nil"/>
-              </w:pBdr>
-              <w:tabs>
-                <w:tab w:val="center" w:pos="4419"/>
-                <w:tab w:val="right" w:pos="8838"/>
-                <w:tab w:val="left" w:pos="32"/>
-              </w:tabs>
-              <w:ind w:left="174"/>
-              <w:rPr>
-                <w:rFonts w:ascii="Arial" w:eastAsia="Arial" w:hAnsi="Arial" w:cs="Arial"/>
-                <w:color w:val="000000"/>
-              </w:rPr>
-            </w:pPr>
-            <w:r>
-              <w:rPr>
-                <w:rFonts w:ascii="Arial" w:eastAsia="Arial" w:hAnsi="Arial" w:cs="Arial"/>
-                <w:color w:val="000000"/>
-              </w:rPr>
-              <w:t>Anotar la fecha de terminación.</w:t>
-            </w:r>
-          </w:p>
-        </w:tc>
-      </w:tr>
-      <w:tr>
-        <w:tc>
-          <w:tcPr>
-            <w:tcW w:w="1559" w:type="dxa"/>
-          </w:tcPr>
-          <w:p>
-            <w:pPr>
-              <w:pBdr>
-                <w:top w:val="nil"/>
-                <w:left w:val="nil"/>
-                <w:bottom w:val="nil"/>
-                <w:right w:val="nil"/>
-                <w:between w:val="nil"/>
-              </w:pBdr>
-              <w:tabs>
-                <w:tab w:val="center" w:pos="4419"/>
-                <w:tab w:val="right" w:pos="8838"/>
-              </w:tabs>
-              <w:jc w:val="center"/>
-              <w:rPr>
-                <w:rFonts w:ascii="Arial" w:eastAsia="Arial" w:hAnsi="Arial" w:cs="Arial"/>
-                <w:color w:val="000000"/>
-              </w:rPr>
-            </w:pPr>
-            <w:r>
-              <w:rPr>
-                <w:rFonts w:ascii="Arial" w:eastAsia="Arial" w:hAnsi="Arial" w:cs="Arial"/>
-                <w:color w:val="000000"/>
-              </w:rPr>
-              <w:t>16</w:t>
-            </w:r>
-          </w:p>
-        </w:tc>
-        <w:tc>
-          <w:tcPr>
-            <w:tcW w:w="8505" w:type="dxa"/>
-          </w:tcPr>
-          <w:p>
-            <w:pPr>
-              <w:pBdr>
-                <w:top w:val="nil"/>
-                <w:left w:val="nil"/>
-                <w:bottom w:val="nil"/>
-                <w:right w:val="nil"/>
-                <w:between w:val="nil"/>
-              </w:pBdr>
-              <w:tabs>
-                <w:tab w:val="center" w:pos="4419"/>
-                <w:tab w:val="right" w:pos="8838"/>
-                <w:tab w:val="left" w:pos="32"/>
-              </w:tabs>
-              <w:ind w:left="174"/>
-              <w:rPr>
-                <w:rFonts w:ascii="Arial" w:eastAsia="Arial" w:hAnsi="Arial" w:cs="Arial"/>
-                <w:color w:val="000000"/>
-              </w:rPr>
-            </w:pPr>
-            <w:r>
-              <w:rPr>
-                <w:rFonts w:ascii="Arial" w:eastAsia="Arial" w:hAnsi="Arial" w:cs="Arial"/>
-                <w:color w:val="000000"/>
-              </w:rPr>
-              <w:t>Anotar las actividades que se realizarán.</w:t>
-            </w:r>
-          </w:p>
-        </w:tc>
-      </w:tr>
-      <w:tr>
-        <w:tc>
-          <w:tcPr>
-            <w:tcW w:w="1559" w:type="dxa"/>
-          </w:tcPr>
-          <w:p>
-            <w:pPr>
-              <w:pBdr>
-                <w:top w:val="nil"/>
-                <w:left w:val="nil"/>
-                <w:bottom w:val="nil"/>
-                <w:right w:val="nil"/>
-                <w:between w:val="nil"/>
-              </w:pBdr>
-              <w:tabs>
-                <w:tab w:val="center" w:pos="4419"/>
-                <w:tab w:val="right" w:pos="8838"/>
-              </w:tabs>
-              <w:jc w:val="center"/>
-              <w:rPr>
-                <w:rFonts w:ascii="Arial" w:eastAsia="Arial" w:hAnsi="Arial" w:cs="Arial"/>
-                <w:color w:val="000000"/>
-              </w:rPr>
-            </w:pPr>
-            <w:r>
-              <w:rPr>
-                <w:rFonts w:ascii="Arial" w:eastAsia="Arial" w:hAnsi="Arial" w:cs="Arial"/>
-                <w:color w:val="000000"/>
-              </w:rPr>
-              <w:t>17</w:t>
-            </w:r>
-          </w:p>
-        </w:tc>
-        <w:tc>
-          <w:tcPr>
-            <w:tcW w:w="8505" w:type="dxa"/>
-          </w:tcPr>
-          <w:p>
-            <w:pPr>
-              <w:pBdr>
-                <w:top w:val="nil"/>
-                <w:left w:val="nil"/>
-                <w:bottom w:val="nil"/>
-                <w:right w:val="nil"/>
-                <w:between w:val="nil"/>
-              </w:pBdr>
-              <w:tabs>
-                <w:tab w:val="center" w:pos="4419"/>
-                <w:tab w:val="right" w:pos="8838"/>
-                <w:tab w:val="left" w:pos="32"/>
-              </w:tabs>
-              <w:ind w:left="174"/>
-              <w:rPr>
-                <w:rFonts w:ascii="Arial" w:eastAsia="Arial" w:hAnsi="Arial" w:cs="Arial"/>
-                <w:color w:val="000000"/>
-              </w:rPr>
-            </w:pPr>
-            <w:r>
-              <w:rPr>
-                <w:rFonts w:ascii="Arial" w:eastAsia="Arial" w:hAnsi="Arial" w:cs="Arial"/>
-                <w:color w:val="000000"/>
-              </w:rPr>
-              <w:t>Marcar con una X el tipo de programa en el que le interesa participar.</w:t>
-            </w:r>
-          </w:p>
-        </w:tc>
-      </w:tr>
-      <w:tr>
-        <w:tc>
-          <w:tcPr>
-            <w:tcW w:w="1559" w:type="dxa"/>
-          </w:tcPr>
-          <w:p>
-            <w:pPr>
-              <w:pBdr>
-                <w:top w:val="nil"/>
-                <w:left w:val="nil"/>
-                <w:bottom w:val="nil"/>
-                <w:right w:val="nil"/>
-                <w:between w:val="nil"/>
-              </w:pBdr>
-              <w:tabs>
-                <w:tab w:val="center" w:pos="4419"/>
-                <w:tab w:val="right" w:pos="8838"/>
-              </w:tabs>
-              <w:jc w:val="center"/>
-              <w:rPr>
-                <w:rFonts w:ascii="Arial" w:eastAsia="Arial" w:hAnsi="Arial" w:cs="Arial"/>
-                <w:color w:val="000000"/>
-              </w:rPr>
-            </w:pPr>
-            <w:r>
-              <w:rPr>
-                <w:rFonts w:ascii="Arial" w:eastAsia="Arial" w:hAnsi="Arial" w:cs="Arial"/>
-                <w:color w:val="000000"/>
-              </w:rPr>
-              <w:t>18</w:t>
-            </w:r>
-          </w:p>
-        </w:tc>
-        <w:tc>
-          <w:tcPr>
-            <w:tcW w:w="8505" w:type="dxa"/>
-          </w:tcPr>
-          <w:p>
-            <w:pPr>
-              <w:pBdr>
-                <w:top w:val="nil"/>
-                <w:left w:val="nil"/>
-                <w:bottom w:val="nil"/>
-                <w:right w:val="nil"/>
-                <w:between w:val="nil"/>
-              </w:pBdr>
-              <w:tabs>
-                <w:tab w:val="center" w:pos="4419"/>
-                <w:tab w:val="right" w:pos="8838"/>
-                <w:tab w:val="left" w:pos="32"/>
-              </w:tabs>
-              <w:ind w:left="174"/>
-              <w:rPr>
-                <w:rFonts w:ascii="Arial" w:eastAsia="Arial" w:hAnsi="Arial" w:cs="Arial"/>
-                <w:color w:val="000000"/>
-              </w:rPr>
-            </w:pPr>
-            <w:r>
-              <w:rPr>
-                <w:rFonts w:ascii="Arial" w:eastAsia="Arial" w:hAnsi="Arial" w:cs="Arial"/>
-                <w:color w:val="000000"/>
-              </w:rPr>
-              <w:t>Anotar si fue aceptado o no.</w:t>
-            </w:r>
-          </w:p>
-        </w:tc>
-      </w:tr>
-      <w:tr>
-        <w:tc>
-          <w:tcPr>
-            <w:tcW w:w="1559" w:type="dxa"/>
-          </w:tcPr>
-          <w:p>
-            <w:pPr>
-              <w:pBdr>
-                <w:top w:val="nil"/>
-                <w:left w:val="nil"/>
-                <w:bottom w:val="nil"/>
-                <w:right w:val="nil"/>
-                <w:between w:val="nil"/>
-              </w:pBdr>
-              <w:tabs>
-                <w:tab w:val="center" w:pos="4419"/>
-                <w:tab w:val="right" w:pos="8838"/>
-              </w:tabs>
-              <w:jc w:val="center"/>
-              <w:rPr>
-                <w:rFonts w:ascii="Arial" w:eastAsia="Arial" w:hAnsi="Arial" w:cs="Arial"/>
-                <w:color w:val="000000"/>
-              </w:rPr>
-            </w:pPr>
-            <w:r>
-              <w:rPr>
-                <w:rFonts w:ascii="Arial" w:eastAsia="Arial" w:hAnsi="Arial" w:cs="Arial"/>
-                <w:color w:val="000000"/>
-              </w:rPr>
-              <w:t>19</w:t>
-            </w:r>
-          </w:p>
-        </w:tc>
-        <w:tc>
-          <w:tcPr>
-            <w:tcW w:w="8505" w:type="dxa"/>
-          </w:tcPr>
-          <w:p>
-            <w:pPr>
-              <w:pBdr>
-                <w:top w:val="nil"/>
-                <w:left w:val="nil"/>
-                <w:bottom w:val="nil"/>
-                <w:right w:val="nil"/>
-                <w:between w:val="nil"/>
-              </w:pBdr>
-              <w:tabs>
-                <w:tab w:val="center" w:pos="4419"/>
-                <w:tab w:val="right" w:pos="8838"/>
-                <w:tab w:val="left" w:pos="32"/>
-              </w:tabs>
-              <w:ind w:left="174"/>
-              <w:rPr>
-                <w:rFonts w:ascii="Arial" w:eastAsia="Arial" w:hAnsi="Arial" w:cs="Arial"/>
-                <w:color w:val="000000"/>
-              </w:rPr>
-            </w:pPr>
-            <w:r>
-              <w:rPr>
-                <w:rFonts w:ascii="Arial" w:eastAsia="Arial" w:hAnsi="Arial" w:cs="Arial"/>
-                <w:color w:val="000000"/>
-              </w:rPr>
-              <w:t>Anotar el motivo por el cual la solicitud fue rechazada.</w:t>
-            </w:r>
-          </w:p>
-        </w:tc>
-      </w:tr>
-      <w:tr>
-        <w:tc>
-          <w:tcPr>
-            <w:tcW w:w="1559" w:type="dxa"/>
-          </w:tcPr>
-          <w:p>
-            <w:pPr>
-              <w:pBdr>
-                <w:top w:val="nil"/>
-                <w:left w:val="nil"/>
-                <w:bottom w:val="nil"/>
-                <w:right w:val="nil"/>
-                <w:between w:val="nil"/>
-              </w:pBdr>
-              <w:tabs>
-                <w:tab w:val="center" w:pos="4419"/>
-                <w:tab w:val="right" w:pos="8838"/>
-              </w:tabs>
-              <w:jc w:val="center"/>
-              <w:rPr>
-                <w:rFonts w:ascii="Arial" w:eastAsia="Arial" w:hAnsi="Arial" w:cs="Arial"/>
-                <w:color w:val="000000"/>
-              </w:rPr>
-            </w:pPr>
-            <w:r>
-              <w:rPr>
-                <w:rFonts w:ascii="Arial" w:eastAsia="Arial" w:hAnsi="Arial" w:cs="Arial"/>
-                <w:color w:val="000000"/>
-              </w:rPr>
-              <w:t>20</w:t>
-            </w:r>
-          </w:p>
-        </w:tc>
-        <w:tc>
-          <w:tcPr>
-            <w:tcW w:w="8505" w:type="dxa"/>
-          </w:tcPr>
-          <w:p>
-            <w:pPr>
-              <w:pBdr>
-                <w:top w:val="nil"/>
-                <w:left w:val="nil"/>
-                <w:bottom w:val="nil"/>
-                <w:right w:val="nil"/>
-                <w:between w:val="nil"/>
-              </w:pBdr>
-              <w:tabs>
-                <w:tab w:val="center" w:pos="4419"/>
-                <w:tab w:val="right" w:pos="8838"/>
-                <w:tab w:val="left" w:pos="851"/>
-              </w:tabs>
-              <w:ind w:left="174"/>
-              <w:rPr>
-                <w:rFonts w:ascii="Arial" w:eastAsia="Arial" w:hAnsi="Arial" w:cs="Arial"/>
-                <w:color w:val="000000"/>
-              </w:rPr>
-            </w:pPr>
-            <w:r>
-              <w:rPr>
-                <w:rFonts w:ascii="Arial" w:eastAsia="Arial" w:hAnsi="Arial" w:cs="Arial"/>
-                <w:color w:val="000000"/>
-              </w:rPr>
-              <w:t>En caso de que haya observaciones anotarlas.</w:t>
-            </w:r>
-          </w:p>
-        </w:tc>
-      </w:tr>
-    </w:tbl>
+        <w:rPr>
+          <w:rFonts w:ascii="Arial" w:eastAsia="Arial" w:hAnsi="Arial" w:cs="Arial"/>
+        </w:rPr>
+      </w:pPr>
+      <w:bookmarkStart w:id="0" w:name="_GoBack"/>
+      <w:bookmarkEnd w:id="0"/>
+    </w:p>
     <w:p>
       <w:pPr>
         <w:pBdr>
@@ -3195,7 +1692,7 @@
               <w:sz w:val="22"/>
               <w:szCs w:val="22"/>
             </w:rPr>
-            <w:t>2</w:t>
+            <w:t>1</w:t>
           </w:r>
           <w:r>
             <w:rPr>
@@ -3256,7 +1753,7 @@
               <w:sz w:val="22"/>
               <w:szCs w:val="22"/>
             </w:rPr>
-            <w:t>2</w:t>
+            <w:t>1</w:t>
           </w:r>
           <w:r>
             <w:rPr>

</xml_diff>